<commit_message>
Move master prompt to Notion, trigger skill on 'national minimum wage'
Co-Authored-By: Claude Opus 5.5 <noreply@anthropic.com>
Claude-Session: https://claude.ai/code/session_014PCeuM3sDQQgDbNANPQoqi
</commit_message>
<xml_diff>
--- a/payroll_nmw/reusable_kit/SOP_Minimum_Pay_and_Pay_Gaps_Review.docx
+++ b/payroll_nmw/reusable_kit/SOP_Minimum_Pay_and_Pay_Gaps_Review.docx
@@ -2198,7 +2198,7 @@
           <w:i w:val="0"/>
           <w:sz w:val="22"/>
         </w:rPr>
-        <w:t>Option A, with Claude: give Claude the populated workbook (or the payroll report) and the Master Prompt in Appendix A. Claude will check the rates on GOV.UK, check the data, and write both one-pagers and the cover email.</w:t>
+        <w:t>Option A, with Claude: type "national minimum wage" in Claude and attach the populated workbook or the payroll report. The National Minimum Wage Review skill (saved in Notion under Hakim Group Payroll) checks the rates on GOV.UK, checks the data, and writes both one-pagers and the cover email.</w:t>
       </w:r>
     </w:p>
     <w:p>
@@ -3200,550 +3200,6 @@
           <w:color w:val="1E1C38"/>
           <w:sz w:val="28"/>
         </w:rPr>
-        <w:t>Appendix A. Master prompt for Claude</w:t>
-      </w:r>
-    </w:p>
-    <w:p>
-      <w:pPr>
-        <w:spacing w:after="60"/>
-      </w:pPr>
-      <w:r>
-        <w:rPr>
-          <w:i/>
-          <w:sz w:val="20"/>
-        </w:rPr>
-        <w:t>Copy this into Claude, attach the payroll report or the populated workbook, and fill in the parts in square brackets.</w:t>
-      </w:r>
-    </w:p>
-    <w:p>
-      <w:pPr>
-        <w:spacing w:after="0"/>
-      </w:pPr>
-      <w:r>
-        <w:rPr>
-          <w:rFonts w:ascii="Consolas" w:hAnsi="Consolas"/>
-          <w:sz w:val="18"/>
-        </w:rPr>
-        <w:t>MASTER PROMPT: Minimum pay rise cost and pay gap analysis (Hakim Group)</w:t>
-      </w:r>
-    </w:p>
-    <w:p>
-      <w:pPr>
-        <w:spacing w:after="0"/>
-      </w:pPr>
-      <w:r>
-        <w:rPr>
-          <w:rFonts w:ascii="Consolas" w:hAnsi="Consolas"/>
-          <w:sz w:val="18"/>
-        </w:rPr>
-      </w:r>
-    </w:p>
-    <w:p>
-      <w:pPr>
-        <w:spacing w:after="0"/>
-      </w:pPr>
-      <w:r>
-        <w:rPr>
-          <w:rFonts w:ascii="Consolas" w:hAnsi="Consolas"/>
-          <w:sz w:val="18"/>
-        </w:rPr>
-        <w:t>Use my hg-minimum-pay-review skill and my hg-one-pager skill.</w:t>
-      </w:r>
-    </w:p>
-    <w:p>
-      <w:pPr>
-        <w:spacing w:after="0"/>
-      </w:pPr>
-      <w:r>
-        <w:rPr>
-          <w:rFonts w:ascii="Consolas" w:hAnsi="Consolas"/>
-          <w:sz w:val="18"/>
-        </w:rPr>
-      </w:r>
-    </w:p>
-    <w:p>
-      <w:pPr>
-        <w:spacing w:after="0"/>
-      </w:pPr>
-      <w:r>
-        <w:rPr>
-          <w:rFonts w:ascii="Consolas" w:hAnsi="Consolas"/>
-          <w:sz w:val="18"/>
-        </w:rPr>
-        <w:t>Context</w:t>
-      </w:r>
-    </w:p>
-    <w:p>
-      <w:pPr>
-        <w:spacing w:after="0"/>
-      </w:pPr>
-      <w:r>
-        <w:rPr>
-          <w:rFonts w:ascii="Consolas" w:hAnsi="Consolas"/>
-          <w:sz w:val="18"/>
-        </w:rPr>
-        <w:t>I am the Head of Payroll at Hakim Group. The government has announced new National Minimum Wage and National Living Wage rates. Management need to know who needs a pay rise, what it costs the company, and how it affects pay gaps for Managers and DOs.</w:t>
-      </w:r>
-    </w:p>
-    <w:p>
-      <w:pPr>
-        <w:spacing w:after="0"/>
-      </w:pPr>
-      <w:r>
-        <w:rPr>
-          <w:rFonts w:ascii="Consolas" w:hAnsi="Consolas"/>
-          <w:sz w:val="18"/>
-        </w:rPr>
-      </w:r>
-    </w:p>
-    <w:p>
-      <w:pPr>
-        <w:spacing w:after="0"/>
-      </w:pPr>
-      <w:r>
-        <w:rPr>
-          <w:rFonts w:ascii="Consolas" w:hAnsi="Consolas"/>
-          <w:sz w:val="18"/>
-        </w:rPr>
-        <w:t>Step 1: Confirm the rates</w:t>
-      </w:r>
-    </w:p>
-    <w:p>
-      <w:pPr>
-        <w:spacing w:after="0"/>
-      </w:pPr>
-      <w:r>
-        <w:rPr>
-          <w:rFonts w:ascii="Consolas" w:hAnsi="Consolas"/>
-          <w:sz w:val="18"/>
-        </w:rPr>
-        <w:t>Check the official rates on GOV.UK (the Budget document or the HMRC rates page), not news websites. Confirm the start date and the rates for 21 and over, 18 to 20, 16 to 17, apprentices and the accommodation offset. Tell me if any source disagrees. Also confirm the employer NI rate and threshold, and the pension qualifying earnings limits, for the new tax year.</w:t>
-      </w:r>
-    </w:p>
-    <w:p>
-      <w:pPr>
-        <w:spacing w:after="0"/>
-      </w:pPr>
-      <w:r>
-        <w:rPr>
-          <w:rFonts w:ascii="Consolas" w:hAnsi="Consolas"/>
-          <w:sz w:val="18"/>
-        </w:rPr>
-      </w:r>
-    </w:p>
-    <w:p>
-      <w:pPr>
-        <w:spacing w:after="0"/>
-      </w:pPr>
-      <w:r>
-        <w:rPr>
-          <w:rFonts w:ascii="Consolas" w:hAnsi="Consolas"/>
-          <w:sz w:val="18"/>
-        </w:rPr>
-        <w:t>Step 2: Use my data</w:t>
-      </w:r>
-    </w:p>
-    <w:p>
-      <w:pPr>
-        <w:spacing w:after="0"/>
-      </w:pPr>
-      <w:r>
-        <w:rPr>
-          <w:rFonts w:ascii="Consolas" w:hAnsi="Consolas"/>
-          <w:sz w:val="18"/>
-        </w:rPr>
-        <w:t>I have attached the [month and year] payroll report. Payroll Ref is in column A. The columns are: Payroll Ref, Category, Job type, Basis, Work location, Pay basis (Annual or Hourly), Occupancy start date, FTE, FTE salary, Pro-rated salary, Contract hours, Weeks worked, Hourly rate, and Age at [start date] worked out from date of birth. [If I have used the HG template workbook, the data is on the Data sheet.]</w:t>
-      </w:r>
-    </w:p>
-    <w:p>
-      <w:pPr>
-        <w:spacing w:after="0"/>
-      </w:pPr>
-      <w:r>
-        <w:rPr>
-          <w:rFonts w:ascii="Consolas" w:hAnsi="Consolas"/>
-          <w:sz w:val="18"/>
-        </w:rPr>
-        <w:t>Before you calculate anything, check the column layout, count the rows, and tell me about blank ages, text errors such as #N/A, duplicate payroll refs and any age under 16 or over 75.</w:t>
-      </w:r>
-    </w:p>
-    <w:p>
-      <w:pPr>
-        <w:spacing w:after="0"/>
-      </w:pPr>
-      <w:r>
-        <w:rPr>
-          <w:rFonts w:ascii="Consolas" w:hAnsi="Consolas"/>
-          <w:sz w:val="18"/>
-        </w:rPr>
-      </w:r>
-    </w:p>
-    <w:p>
-      <w:pPr>
-        <w:spacing w:after="0"/>
-      </w:pPr>
-      <w:r>
-        <w:rPr>
-          <w:rFonts w:ascii="Consolas" w:hAnsi="Consolas"/>
-          <w:sz w:val="18"/>
-        </w:rPr>
-        <w:t>Step 3: Work out the cost</w:t>
-      </w:r>
-    </w:p>
-    <w:p>
-      <w:pPr>
-        <w:spacing w:after="0"/>
-      </w:pPr>
-      <w:r>
-        <w:rPr>
-          <w:rFonts w:ascii="Consolas" w:hAnsi="Consolas"/>
-          <w:sz w:val="18"/>
-        </w:rPr>
-        <w:t>For every job:</w:t>
-      </w:r>
-    </w:p>
-    <w:p>
-      <w:pPr>
-        <w:spacing w:after="0"/>
-      </w:pPr>
-      <w:r>
-        <w:rPr>
-          <w:rFonts w:ascii="Consolas" w:hAnsi="Consolas"/>
-          <w:sz w:val="18"/>
-        </w:rPr>
-        <w:t>- Find the new minimum rate for their age on the start date. Apprentices get the apprentice rate if they are under 19 or in their first year. Under 16s are not entitled.</w:t>
-      </w:r>
-    </w:p>
-    <w:p>
-      <w:pPr>
-        <w:spacing w:after="0"/>
-      </w:pPr>
-      <w:r>
-        <w:rPr>
-          <w:rFonts w:ascii="Consolas" w:hAnsi="Consolas"/>
-          <w:sz w:val="18"/>
-        </w:rPr>
-        <w:t>- Compare their hourly rate (rounded to 2 decimal places) to the new rate. If it is lower, they need a rise to the new rate.</w:t>
-      </w:r>
-    </w:p>
-    <w:p>
-      <w:pPr>
-        <w:spacing w:after="0"/>
-      </w:pPr>
-      <w:r>
-        <w:rPr>
-          <w:rFonts w:ascii="Consolas" w:hAnsi="Consolas"/>
-          <w:sz w:val="18"/>
-        </w:rPr>
-        <w:t>- Salaried staff: new yearly pay = pro-rated salary x new rate / current rate.</w:t>
-      </w:r>
-    </w:p>
-    <w:p>
-      <w:pPr>
-        <w:spacing w:after="0"/>
-      </w:pPr>
-      <w:r>
-        <w:rPr>
-          <w:rFonts w:ascii="Consolas" w:hAnsi="Consolas"/>
-          <w:sz w:val="18"/>
-        </w:rPr>
-        <w:t>- Hourly paid staff: yearly pay = hourly rate x contract hours a week x weeks worked. Flag anyone with no set hours as not costed.</w:t>
-      </w:r>
-    </w:p>
-    <w:p>
-      <w:pPr>
-        <w:spacing w:after="0"/>
-      </w:pPr>
-      <w:r>
-        <w:rPr>
-          <w:rFonts w:ascii="Consolas" w:hAnsi="Consolas"/>
-          <w:sz w:val="18"/>
-        </w:rPr>
-        <w:t>- Staff who need no rise must show no change.</w:t>
-      </w:r>
-    </w:p>
-    <w:p>
-      <w:pPr>
-        <w:spacing w:after="0"/>
-      </w:pPr>
-      <w:r>
-        <w:rPr>
-          <w:rFonts w:ascii="Consolas" w:hAnsi="Consolas"/>
-          <w:sz w:val="18"/>
-        </w:rPr>
-        <w:t>- Add company NI at [15%] above [£5,000] a year and company pension at [3%] of qualifying earnings between [£6,240] and [£50,270].</w:t>
-      </w:r>
-    </w:p>
-    <w:p>
-      <w:pPr>
-        <w:spacing w:after="0"/>
-      </w:pPr>
-      <w:r>
-        <w:rPr>
-          <w:rFonts w:ascii="Consolas" w:hAnsi="Consolas"/>
-          <w:sz w:val="18"/>
-        </w:rPr>
-        <w:t>- Show a full 12-month cost from the start date, and the monthly cost as yearly divided by 12.</w:t>
-      </w:r>
-    </w:p>
-    <w:p>
-      <w:pPr>
-        <w:spacing w:after="0"/>
-      </w:pPr>
-      <w:r>
-        <w:rPr>
-          <w:rFonts w:ascii="Consolas" w:hAnsi="Consolas"/>
-          <w:sz w:val="18"/>
-        </w:rPr>
-        <w:t>Also flag: anyone paid below today's minimum, apprentices who move to the age rate later, and staff who turn 18 or 21 during the year.</w:t>
-      </w:r>
-    </w:p>
-    <w:p>
-      <w:pPr>
-        <w:spacing w:after="0"/>
-      </w:pPr>
-      <w:r>
-        <w:rPr>
-          <w:rFonts w:ascii="Consolas" w:hAnsi="Consolas"/>
-          <w:sz w:val="18"/>
-        </w:rPr>
-      </w:r>
-    </w:p>
-    <w:p>
-      <w:pPr>
-        <w:spacing w:after="0"/>
-      </w:pPr>
-      <w:r>
-        <w:rPr>
-          <w:rFonts w:ascii="Consolas" w:hAnsi="Consolas"/>
-          <w:sz w:val="18"/>
-        </w:rPr>
-        <w:t>Step 4: Pay gaps (pay compression)</w:t>
-      </w:r>
-    </w:p>
-    <w:p>
-      <w:pPr>
-        <w:spacing w:after="0"/>
-      </w:pPr>
-      <w:r>
-        <w:rPr>
-          <w:rFonts w:ascii="Consolas" w:hAnsi="Consolas"/>
-          <w:sz w:val="18"/>
-        </w:rPr>
-        <w:t>Compare Managers (Practice Manager and PP - Practice Manager) and DOs (Dispensing Optician and PP - Dispensing Optician) with Optical Assistants.</w:t>
-      </w:r>
-    </w:p>
-    <w:p>
-      <w:pPr>
-        <w:spacing w:after="0"/>
-      </w:pPr>
-      <w:r>
-        <w:rPr>
-          <w:rFonts w:ascii="Consolas" w:hAnsi="Consolas"/>
-          <w:sz w:val="18"/>
-        </w:rPr>
-        <w:t>Show for each group: number of jobs, median hourly pay, median gap above the adult minimum today and after the change, how many are within £1 of the minimum, how many will be on the minimum, and the median lead over Optical Assistants.</w:t>
-      </w:r>
-    </w:p>
-    <w:p>
-      <w:pPr>
-        <w:spacing w:after="0"/>
-      </w:pPr>
-      <w:r>
-        <w:rPr>
-          <w:rFonts w:ascii="Consolas" w:hAnsi="Consolas"/>
-          <w:sz w:val="18"/>
-        </w:rPr>
-        <w:t>Cost three options on top of the minimum pay rise:</w:t>
-      </w:r>
-    </w:p>
-    <w:p>
-      <w:pPr>
-        <w:spacing w:after="0"/>
-      </w:pPr>
-      <w:r>
-        <w:rPr>
-          <w:rFonts w:ascii="Consolas" w:hAnsi="Consolas"/>
-          <w:sz w:val="18"/>
-        </w:rPr>
-        <w:t>1. Lift any Manager or DO to at least £1 above the new minimum.</w:t>
-      </w:r>
-    </w:p>
-    <w:p>
-      <w:pPr>
-        <w:spacing w:after="0"/>
-      </w:pPr>
-      <w:r>
-        <w:rPr>
-          <w:rFonts w:ascii="Consolas" w:hAnsi="Consolas"/>
-          <w:sz w:val="18"/>
-        </w:rPr>
-        <w:t>2. Give every Manager and DO the same pence rise as the minimum.</w:t>
-      </w:r>
-    </w:p>
-    <w:p>
-      <w:pPr>
-        <w:spacing w:after="0"/>
-      </w:pPr>
-      <w:r>
-        <w:rPr>
-          <w:rFonts w:ascii="Consolas" w:hAnsi="Consolas"/>
-          <w:sz w:val="18"/>
-        </w:rPr>
-        <w:t>3. Keep the same percentage gap for every Manager and DO.</w:t>
-      </w:r>
-    </w:p>
-    <w:p>
-      <w:pPr>
-        <w:spacing w:after="0"/>
-      </w:pPr>
-      <w:r>
-        <w:rPr>
-          <w:rFonts w:ascii="Consolas" w:hAnsi="Consolas"/>
-          <w:sz w:val="18"/>
-        </w:rPr>
-      </w:r>
-    </w:p>
-    <w:p>
-      <w:pPr>
-        <w:spacing w:after="0"/>
-      </w:pPr>
-      <w:r>
-        <w:rPr>
-          <w:rFonts w:ascii="Consolas" w:hAnsi="Consolas"/>
-          <w:sz w:val="18"/>
-        </w:rPr>
-        <w:t>Step 5: Check your work</w:t>
-      </w:r>
-    </w:p>
-    <w:p>
-      <w:pPr>
-        <w:spacing w:after="0"/>
-      </w:pPr>
-      <w:r>
-        <w:rPr>
-          <w:rFonts w:ascii="Consolas" w:hAnsi="Consolas"/>
-          <w:sz w:val="18"/>
-        </w:rPr>
-        <w:t>Cross-check the totals with a second, independent calculation. Re-read every figure on the one-pagers against the workbook.</w:t>
-      </w:r>
-    </w:p>
-    <w:p>
-      <w:pPr>
-        <w:spacing w:after="0"/>
-      </w:pPr>
-      <w:r>
-        <w:rPr>
-          <w:rFonts w:ascii="Consolas" w:hAnsi="Consolas"/>
-          <w:sz w:val="18"/>
-        </w:rPr>
-      </w:r>
-    </w:p>
-    <w:p>
-      <w:pPr>
-        <w:spacing w:after="0"/>
-      </w:pPr>
-      <w:r>
-        <w:rPr>
-          <w:rFonts w:ascii="Consolas" w:hAnsi="Consolas"/>
-          <w:sz w:val="18"/>
-        </w:rPr>
-        <w:t>Step 6: Outputs</w:t>
-      </w:r>
-    </w:p>
-    <w:p>
-      <w:pPr>
-        <w:spacing w:after="0"/>
-      </w:pPr>
-      <w:r>
-        <w:rPr>
-          <w:rFonts w:ascii="Consolas" w:hAnsi="Consolas"/>
-          <w:sz w:val="18"/>
-        </w:rPr>
-        <w:t>1. A backup workbook with Summary, Pay Gaps, Data and Rates sheets, live formulas, and a "today compared with new rates" table for the affected jobs and the whole company.</w:t>
-      </w:r>
-    </w:p>
-    <w:p>
-      <w:pPr>
-        <w:spacing w:after="0"/>
-      </w:pPr>
-      <w:r>
-        <w:rPr>
-          <w:rFonts w:ascii="Consolas" w:hAnsi="Consolas"/>
-          <w:sz w:val="18"/>
-        </w:rPr>
-        <w:t>2. A one-page management summary of the cost, in HG style, Hakim Group pink and navy, Aptos 11, plain English for a reading age of 10, no payroll jargon, with a "How we worked this out" section naming the data source and period.</w:t>
-      </w:r>
-    </w:p>
-    <w:p>
-      <w:pPr>
-        <w:spacing w:after="0"/>
-      </w:pPr>
-      <w:r>
-        <w:rPr>
-          <w:rFonts w:ascii="Consolas" w:hAnsi="Consolas"/>
-          <w:sz w:val="18"/>
-        </w:rPr>
-        <w:t>3. A one-page pay gaps summary for senior leaders with a chart, the three options and suggested next steps.</w:t>
-      </w:r>
-    </w:p>
-    <w:p>
-      <w:pPr>
-        <w:spacing w:after="0"/>
-      </w:pPr>
-      <w:r>
-        <w:rPr>
-          <w:rFonts w:ascii="Consolas" w:hAnsi="Consolas"/>
-          <w:sz w:val="18"/>
-        </w:rPr>
-        <w:t>4. A short HG-voice email to send with the reports.</w:t>
-      </w:r>
-    </w:p>
-    <w:p>
-      <w:pPr>
-        <w:spacing w:after="0"/>
-      </w:pPr>
-      <w:r>
-        <w:rPr>
-          <w:rFonts w:ascii="Consolas" w:hAnsi="Consolas"/>
-          <w:sz w:val="18"/>
-        </w:rPr>
-      </w:r>
-    </w:p>
-    <w:p>
-      <w:pPr>
-        <w:spacing w:after="0"/>
-      </w:pPr>
-      <w:r>
-        <w:rPr>
-          <w:rFonts w:ascii="Consolas" w:hAnsi="Consolas"/>
-          <w:sz w:val="18"/>
-        </w:rPr>
-        <w:t>Rules</w:t>
-      </w:r>
-    </w:p>
-    <w:p>
-      <w:pPr>
-        <w:spacing w:after="0"/>
-      </w:pPr>
-      <w:r>
-        <w:rPr>
-          <w:rFonts w:ascii="Consolas" w:hAnsi="Consolas"/>
-          <w:sz w:val="18"/>
-        </w:rPr>
-        <w:t>Do not save staff data to GitHub or anywhere outside this session. Ask me before assuming anything that is missing, for example the pension rate or a job title mapping.</w:t>
-      </w:r>
-    </w:p>
-    <w:p>
-      <w:pPr>
-        <w:spacing w:before="200" w:after="60"/>
-      </w:pPr>
-      <w:r>
-        <w:rPr>
-          <w:b/>
-          <w:color w:val="1E1C38"/>
-          <w:sz w:val="28"/>
-        </w:rPr>
         <w:t>Version control</w:t>
       </w:r>
     </w:p>

</xml_diff>

<commit_message>
Use age only, never dates of birth, in template, SOP and skill
Co-Authored-By: Claude Opus 5.5 <noreply@anthropic.com>
Claude-Session: https://claude.ai/code/session_014PCeuM3sDQQgDbNANPQoqi
</commit_message>
<xml_diff>
--- a/payroll_nmw/reusable_kit/SOP_Minimum_Pay_and_Pay_Gaps_Review.docx
+++ b/payroll_nmw/reusable_kit/SOP_Minimum_Pay_and_Pay_Gaps_Review.docx
@@ -1036,7 +1036,7 @@
                 <w:b w:val="0"/>
                 <w:sz w:val="20"/>
               </w:rPr>
-              <w:t>Date of birth</w:t>
+              <w:t>Age</w:t>
             </w:r>
           </w:p>
         </w:tc>
@@ -1054,7 +1054,7 @@
                 <w:b w:val="0"/>
                 <w:sz w:val="20"/>
               </w:rPr>
-              <w:t>A real date (dd/mm/yyyy). Age is worked out for you.</w:t>
+              <w:t>Age on the date the new rates start. Work it out in your own file: =DATEDIF(DOB,DATE(2027,4,1),"Y"). Inside Hakim Group only, you can paste the date of birth instead. Never send dates of birth outside the company.</w:t>
             </w:r>
           </w:p>
         </w:tc>
@@ -2198,7 +2198,7 @@
           <w:i w:val="0"/>
           <w:sz w:val="22"/>
         </w:rPr>
-        <w:t>Option A, with Claude: type "national minimum wage" in Claude and attach the populated workbook or the payroll report. The National Minimum Wage Review skill (saved in Notion under Hakim Group Payroll) checks the rates on GOV.UK, checks the data, and writes both one-pagers and the cover email.</w:t>
+        <w:t>Option A, with Claude: type "national minimum wage" in Claude and attach the populated workbook or the payroll report, with ages only (no dates of birth). The National Minimum Wage Review skill (saved in Notion under Hakim Group Payroll) checks the rates on GOV.UK, checks the data, and writes both one-pagers and the cover email.</w:t>
       </w:r>
     </w:p>
     <w:p>
@@ -2770,7 +2770,7 @@
                 <w:b w:val="0"/>
                 <w:sz w:val="20"/>
               </w:rPr>
-              <w:t>Age shows 127</w:t>
+              <w:t>Age shows 127 in your own file</w:t>
             </w:r>
           </w:p>
         </w:tc>
@@ -2788,7 +2788,7 @@
                 <w:b w:val="0"/>
                 <w:sz w:val="20"/>
               </w:rPr>
-              <w:t>The date of birth column is in the wrong place, so the age is worked out from the hourly rate</w:t>
+              <w:t>The DATEDIF formula points at the hourly rate, not the date of birth</w:t>
             </w:r>
           </w:p>
         </w:tc>
@@ -2806,7 +2806,7 @@
                 <w:b w:val="0"/>
                 <w:sz w:val="20"/>
               </w:rPr>
-              <w:t>Move the date of birth into column N</w:t>
+              <w:t>Click the date of birth cell to build the formula, then paste the ages as values into column N</w:t>
             </w:r>
           </w:p>
         </w:tc>
@@ -2844,7 +2844,7 @@
                 <w:b w:val="0"/>
                 <w:sz w:val="20"/>
               </w:rPr>
-              <w:t>Date of birth missing or stored as text Excel cannot read</w:t>
+              <w:t>Column N is empty or holds text</w:t>
             </w:r>
           </w:p>
         </w:tc>
@@ -2862,7 +2862,7 @@
                 <w:b w:val="0"/>
                 <w:sz w:val="20"/>
               </w:rPr>
-              <w:t>Re-type the date as dd/mm/yyyy</w:t>
+              <w:t>Paste the age as a number</w:t>
             </w:r>
           </w:p>
         </w:tc>

</xml_diff>

<commit_message>
Keep date of birth in template; replace with ages before sharing
Co-Authored-By: Claude Opus 5.5 <noreply@anthropic.com>
Claude-Session: https://claude.ai/code/session_014PCeuM3sDQQgDbNANPQoqi
</commit_message>
<xml_diff>
--- a/payroll_nmw/reusable_kit/SOP_Minimum_Pay_and_Pay_Gaps_Review.docx
+++ b/payroll_nmw/reusable_kit/SOP_Minimum_Pay_and_Pay_Gaps_Review.docx
@@ -1036,7 +1036,7 @@
                 <w:b w:val="0"/>
                 <w:sz w:val="20"/>
               </w:rPr>
-              <w:t>Age</w:t>
+              <w:t>Date of birth</w:t>
             </w:r>
           </w:p>
         </w:tc>
@@ -1054,7 +1054,7 @@
                 <w:b w:val="0"/>
                 <w:sz w:val="20"/>
               </w:rPr>
-              <w:t>Age on the date the new rates start. Work it out in your own file: =DATEDIF(DOB,DATE(2027,4,1),"Y"). Inside Hakim Group only, you can paste the date of birth instead. Never send dates of birth outside the company.</w:t>
+              <w:t>A real date (dd/mm/yyyy). Column O works out the age on the date the new rates start. Before sharing the file, including with Claude, copy column O and Paste Special, Values over column N, so only ages remain.</w:t>
             </w:r>
           </w:p>
         </w:tc>
@@ -1204,6 +1204,15 @@
       </w:r>
       <w:r>
         <w:t>see section 7.</w:t>
+      </w:r>
+    </w:p>
+    <w:p>
+      <w:pPr>
+        <w:pStyle w:val="ListNumber"/>
+        <w:spacing w:after="20"/>
+      </w:pPr>
+      <w:r>
+        <w:t>Remove dates of birth before sharing: copy column O, then Paste Special, Values over column N. Only ages remain and all figures stay the same.</w:t>
       </w:r>
     </w:p>
     <w:p>
@@ -2198,7 +2207,7 @@
           <w:i w:val="0"/>
           <w:sz w:val="22"/>
         </w:rPr>
-        <w:t>Option A, with Claude: type "national minimum wage" in Claude and attach the populated workbook or the payroll report, with ages only (no dates of birth). The National Minimum Wage Review skill (saved in Notion under Hakim Group Payroll) checks the rates on GOV.UK, checks the data, and writes both one-pagers and the cover email.</w:t>
+        <w:t>Option A, with Claude: type "national minimum wage" in Claude and attach the populated workbook or the payroll report, after you have replaced the dates of birth with ages (step 9). The National Minimum Wage Review skill (saved in Notion under Hakim Group Payroll) checks the rates on GOV.UK, checks the data, and writes both one-pagers and the cover email.</w:t>
       </w:r>
     </w:p>
     <w:p>
@@ -2770,7 +2779,7 @@
                 <w:b w:val="0"/>
                 <w:sz w:val="20"/>
               </w:rPr>
-              <w:t>Age shows 127 in your own file</w:t>
+              <w:t>Age shows 127</w:t>
             </w:r>
           </w:p>
         </w:tc>
@@ -2788,7 +2797,7 @@
                 <w:b w:val="0"/>
                 <w:sz w:val="20"/>
               </w:rPr>
-              <w:t>The DATEDIF formula points at the hourly rate, not the date of birth</w:t>
+              <w:t>The date of birth is not in column N, so the age is worked out from another column</w:t>
             </w:r>
           </w:p>
         </w:tc>
@@ -2806,7 +2815,7 @@
                 <w:b w:val="0"/>
                 <w:sz w:val="20"/>
               </w:rPr>
-              <w:t>Click the date of birth cell to build the formula, then paste the ages as values into column N</w:t>
+              <w:t>Move the dates of birth into column N</w:t>
             </w:r>
           </w:p>
         </w:tc>
@@ -2844,7 +2853,7 @@
                 <w:b w:val="0"/>
                 <w:sz w:val="20"/>
               </w:rPr>
-              <w:t>Column N is empty or holds text</w:t>
+              <w:t>Date of birth missing or stored as text</w:t>
             </w:r>
           </w:p>
         </w:tc>
@@ -2862,7 +2871,7 @@
                 <w:b w:val="0"/>
                 <w:sz w:val="20"/>
               </w:rPr>
-              <w:t>Paste the age as a number</w:t>
+              <w:t>Re-type the date as dd/mm/yyyy</w:t>
             </w:r>
           </w:p>
         </w:tc>

</xml_diff>